<commit_message>
v3.1.0: Sistema completo instalable, documentacion README/CHANGELOG, motor IA con Argos Ledger y parser por bloques Intertek
</commit_message>
<xml_diff>
--- a/DJ Conformidad Modelo SE LIMPIO.docx
+++ b/DJ Conformidad Modelo SE LIMPIO.docx
@@ -2,23 +2,6 @@
 <file path=word/document.xml><?xml version="1.0" encoding="utf-8"?>
 <w:document xmlns:wpc="http://schemas.microsoft.com/office/word/2010/wordprocessingCanvas" xmlns:cx="http://schemas.microsoft.com/office/drawing/2014/chartex" xmlns:cx1="http://schemas.microsoft.com/office/drawing/2015/9/8/chartex" xmlns:cx2="http://schemas.microsoft.com/office/drawing/2015/10/21/chartex" xmlns:cx3="http://schemas.microsoft.com/office/drawing/2016/5/9/chartex" xmlns:cx4="http://schemas.microsoft.com/office/drawing/2016/5/10/chartex" xmlns:cx5="http://schemas.microsoft.com/office/drawing/2016/5/11/chartex" xmlns:cx6="http://schemas.microsoft.com/office/drawing/2016/5/12/chartex" xmlns:cx7="http://schemas.microsoft.com/office/drawing/2016/5/13/chartex" xmlns:cx8="http://schemas.microsoft.com/office/drawing/2016/5/14/chartex" xmlns:mc="http://schemas.openxmlformats.org/markup-compatibility/2006" xmlns:aink="http://schemas.microsoft.com/office/drawing/2016/ink" xmlns:am3d="http://schemas.microsoft.com/office/drawing/2017/model3d" xmlns:o="urn:schemas-microsoft-com:office:office" xmlns:oel="http://schemas.microsoft.com/office/2019/extlst" xmlns:r="http://schemas.openxmlformats.org/officeDocument/2006/relationships" xmlns:m="http://schemas.openxmlformats.org/officeDocument/2006/math" xmlns:v="urn:schemas-microsoft-com:vml" xmlns:wp14="http://schemas.microsoft.com/office/word/2010/wordprocessingDrawing" xmlns:wp="http://schemas.openxmlformats.org/drawingml/2006/wordprocessingDrawing" xmlns:w10="urn:schemas-microsoft-com:office:word" xmlns:w="http://schemas.openxmlformats.org/wordprocessingml/2006/main" xmlns:w14="http://schemas.microsoft.com/office/word/2010/wordml" xmlns:w15="http://schemas.microsoft.com/office/word/2012/wordml" xmlns:w16cex="http://schemas.microsoft.com/office/word/2018/wordml/cex" xmlns:w16cid="http://schemas.microsoft.com/office/word/2016/wordml/cid" xmlns:w16="http://schemas.microsoft.com/office/word/2018/wordml" xmlns:w16du="http://schemas.microsoft.com/office/word/2023/wordml/word16du" xmlns:w16sdtdh="http://schemas.microsoft.com/office/word/2020/wordml/sdtdatahash" xmlns:w16sdtfl="http://schemas.microsoft.com/office/word/2024/wordml/sdtformatlock" xmlns:w16se="http://schemas.microsoft.com/office/word/2015/wordml/symex" xmlns:wpg="http://schemas.microsoft.com/office/word/2010/wordprocessingGroup" xmlns:wpi="http://schemas.microsoft.com/office/word/2010/wordprocessingInk" xmlns:wne="http://schemas.microsoft.com/office/word/2006/wordml" xmlns:wps="http://schemas.microsoft.com/office/word/2010/wordprocessingShape" mc:Ignorable="w14 w15 w16se w16cid w16 w16cex w16sdtdh w16sdtfl w16du wp14">
   <w:body>
-    <w:p>
-      <w:pPr>
-        <w:pBdr>
-          <w:top w:val="nil"/>
-          <w:left w:val="nil"/>
-          <w:bottom w:val="nil"/>
-          <w:right w:val="nil"/>
-          <w:between w:val="nil"/>
-        </w:pBdr>
-        <w:spacing w:before="5"/>
-        <w:rPr>
-          <w:rFonts w:ascii="Arial" w:eastAsia="Arial" w:hAnsi="Arial" w:cs="Arial"/>
-          <w:sz w:val="16"/>
-          <w:szCs w:val="16"/>
-        </w:rPr>
-      </w:pPr>
-    </w:p>
     <w:p>
       <w:pPr>
         <w:pBdr>
@@ -64,7 +47,6 @@
         <w:tc>
           <w:tcPr>
             <w:tcW w:w="3139" w:type="dxa"/>
-            <w:shd w:val="clear" w:color="auto" w:fill="auto"/>
             <w:tcMar>
               <w:top w:w="100" w:type="dxa"/>
               <w:left w:w="100" w:type="dxa"/>
@@ -843,7 +825,7 @@
     <w:tbl>
       <w:tblPr>
         <w:tblStyle w:val="a0"/>
-        <w:tblW w:w="8978" w:type="dxa"/>
+        <w:tblW w:w="9638" w:type="dxa"/>
         <w:tblInd w:w="138" w:type="dxa"/>
         <w:tblBorders>
           <w:top w:val="single" w:sz="4" w:space="0" w:color="000000"/>
@@ -858,7 +840,7 @@
       </w:tblPr>
       <w:tblGrid>
         <w:gridCol w:w="4502"/>
-        <w:gridCol w:w="4476"/>
+        <w:gridCol w:w="5136"/>
       </w:tblGrid>
       <w:tr>
         <w:tc>
@@ -922,7 +904,7 @@
         </w:tc>
         <w:tc>
           <w:tcPr>
-            <w:tcW w:w="4476" w:type="dxa"/>
+            <w:tcW w:w="5136" w:type="dxa"/>
             <w:tcBorders>
               <w:top w:val="dotted" w:sz="4" w:space="0" w:color="000000"/>
               <w:left w:val="dotted" w:sz="4" w:space="0" w:color="000000"/>
@@ -1049,7 +1031,7 @@
         </w:tc>
         <w:tc>
           <w:tcPr>
-            <w:tcW w:w="4476" w:type="dxa"/>
+            <w:tcW w:w="5136" w:type="dxa"/>
             <w:tcBorders>
               <w:top w:val="dotted" w:sz="4" w:space="0" w:color="000000"/>
               <w:left w:val="dotted" w:sz="4" w:space="0" w:color="000000"/>
@@ -1163,7 +1145,7 @@
         </w:tc>
         <w:tc>
           <w:tcPr>
-            <w:tcW w:w="4476" w:type="dxa"/>
+            <w:tcW w:w="5136" w:type="dxa"/>
             <w:tcBorders>
               <w:top w:val="dotted" w:sz="4" w:space="0" w:color="000000"/>
               <w:left w:val="dotted" w:sz="4" w:space="0" w:color="000000"/>
@@ -1277,7 +1259,7 @@
         </w:tc>
         <w:tc>
           <w:tcPr>
-            <w:tcW w:w="4476" w:type="dxa"/>
+            <w:tcW w:w="5136" w:type="dxa"/>
             <w:tcBorders>
               <w:top w:val="dotted" w:sz="4" w:space="0" w:color="000000"/>
               <w:left w:val="dotted" w:sz="4" w:space="0" w:color="000000"/>
@@ -1311,7 +1293,34 @@
                 <w:sz w:val="16"/>
                 <w:szCs w:val="16"/>
               </w:rPr>
-              <w:t>Bouchard 468, 5° I, CABA. CP 1004</w:t>
+              <w:t>Bouchard 468, 5° I, CABA. CP 1</w:t>
+            </w:r>
+            <w:r>
+              <w:rPr>
+                <w:rFonts w:ascii="Arial" w:eastAsia="Arial" w:hAnsi="Arial" w:cs="Arial"/>
+                <w:color w:val="000000"/>
+                <w:sz w:val="16"/>
+                <w:szCs w:val="16"/>
+              </w:rPr>
+              <w:t>1</w:t>
+            </w:r>
+            <w:r>
+              <w:rPr>
+                <w:rFonts w:ascii="Arial" w:eastAsia="Arial" w:hAnsi="Arial" w:cs="Arial"/>
+                <w:color w:val="000000"/>
+                <w:sz w:val="16"/>
+                <w:szCs w:val="16"/>
+              </w:rPr>
+              <w:t>0</w:t>
+            </w:r>
+            <w:r>
+              <w:rPr>
+                <w:rFonts w:ascii="Arial" w:eastAsia="Arial" w:hAnsi="Arial" w:cs="Arial"/>
+                <w:color w:val="000000"/>
+                <w:sz w:val="16"/>
+                <w:szCs w:val="16"/>
+              </w:rPr>
+              <w:t>6</w:t>
             </w:r>
           </w:p>
         </w:tc>
@@ -1410,7 +1419,7 @@
         </w:tc>
         <w:tc>
           <w:tcPr>
-            <w:tcW w:w="4476" w:type="dxa"/>
+            <w:tcW w:w="5136" w:type="dxa"/>
             <w:tcBorders>
               <w:top w:val="dotted" w:sz="4" w:space="0" w:color="000000"/>
               <w:left w:val="dotted" w:sz="4" w:space="0" w:color="000000"/>
@@ -1511,7 +1520,7 @@
         </w:tc>
         <w:tc>
           <w:tcPr>
-            <w:tcW w:w="4476" w:type="dxa"/>
+            <w:tcW w:w="5136" w:type="dxa"/>
             <w:tcBorders>
               <w:top w:val="dotted" w:sz="4" w:space="0" w:color="000000"/>
               <w:left w:val="dotted" w:sz="4" w:space="0" w:color="000000"/>
@@ -1625,7 +1634,7 @@
         </w:tc>
         <w:tc>
           <w:tcPr>
-            <w:tcW w:w="4476" w:type="dxa"/>
+            <w:tcW w:w="5136" w:type="dxa"/>
             <w:tcBorders>
               <w:top w:val="dotted" w:sz="4" w:space="0" w:color="000000"/>
               <w:left w:val="dotted" w:sz="4" w:space="0" w:color="000000"/>
@@ -1732,7 +1741,7 @@
     <w:tbl>
       <w:tblPr>
         <w:tblStyle w:val="a1"/>
-        <w:tblW w:w="8978" w:type="dxa"/>
+        <w:tblW w:w="9638" w:type="dxa"/>
         <w:tblInd w:w="138" w:type="dxa"/>
         <w:tblBorders>
           <w:top w:val="single" w:sz="4" w:space="0" w:color="000000"/>
@@ -1747,7 +1756,7 @@
       </w:tblPr>
       <w:tblGrid>
         <w:gridCol w:w="4488"/>
-        <w:gridCol w:w="4490"/>
+        <w:gridCol w:w="5150"/>
       </w:tblGrid>
       <w:tr>
         <w:tc>
@@ -1823,7 +1832,7 @@
         </w:tc>
         <w:tc>
           <w:tcPr>
-            <w:tcW w:w="4490" w:type="dxa"/>
+            <w:tcW w:w="5150" w:type="dxa"/>
             <w:tcBorders>
               <w:top w:val="dotted" w:sz="4" w:space="0" w:color="000000"/>
               <w:left w:val="dotted" w:sz="4" w:space="0" w:color="000000"/>
@@ -1922,7 +1931,7 @@
         </w:tc>
         <w:tc>
           <w:tcPr>
-            <w:tcW w:w="4490" w:type="dxa"/>
+            <w:tcW w:w="5150" w:type="dxa"/>
             <w:tcBorders>
               <w:top w:val="dotted" w:sz="4" w:space="0" w:color="000000"/>
               <w:left w:val="dotted" w:sz="4" w:space="0" w:color="000000"/>
@@ -1995,7 +2004,7 @@
         </w:tc>
         <w:tc>
           <w:tcPr>
-            <w:tcW w:w="4490" w:type="dxa"/>
+            <w:tcW w:w="5150" w:type="dxa"/>
             <w:tcBorders>
               <w:top w:val="dotted" w:sz="4" w:space="0" w:color="000000"/>
               <w:left w:val="dotted" w:sz="4" w:space="0" w:color="000000"/>
@@ -2073,7 +2082,7 @@
     <w:tbl>
       <w:tblPr>
         <w:tblStyle w:val="a2"/>
-        <w:tblW w:w="8978" w:type="dxa"/>
+        <w:tblW w:w="9638" w:type="dxa"/>
         <w:tblInd w:w="138" w:type="dxa"/>
         <w:tblBorders>
           <w:top w:val="single" w:sz="4" w:space="0" w:color="000000"/>
@@ -2088,7 +2097,7 @@
       </w:tblPr>
       <w:tblGrid>
         <w:gridCol w:w="4488"/>
-        <w:gridCol w:w="4490"/>
+        <w:gridCol w:w="5150"/>
       </w:tblGrid>
       <w:tr>
         <w:tc>
@@ -2184,7 +2193,7 @@
         </w:tc>
         <w:tc>
           <w:tcPr>
-            <w:tcW w:w="4490" w:type="dxa"/>
+            <w:tcW w:w="5150" w:type="dxa"/>
             <w:tcBorders>
               <w:top w:val="dotted" w:sz="4" w:space="0" w:color="000000"/>
               <w:left w:val="dotted" w:sz="4" w:space="0" w:color="000000"/>
@@ -2271,7 +2280,7 @@
         </w:tc>
         <w:tc>
           <w:tcPr>
-            <w:tcW w:w="4490" w:type="dxa"/>
+            <w:tcW w:w="5150" w:type="dxa"/>
             <w:tcBorders>
               <w:top w:val="dotted" w:sz="4" w:space="0" w:color="000000"/>
               <w:left w:val="dotted" w:sz="4" w:space="0" w:color="000000"/>
@@ -2330,7 +2339,7 @@
         </w:tc>
         <w:tc>
           <w:tcPr>
-            <w:tcW w:w="4490" w:type="dxa"/>
+            <w:tcW w:w="5150" w:type="dxa"/>
             <w:tcBorders>
               <w:top w:val="dotted" w:sz="4" w:space="0" w:color="000000"/>
               <w:left w:val="dotted" w:sz="4" w:space="0" w:color="000000"/>
@@ -2417,7 +2426,7 @@
         </w:tc>
         <w:tc>
           <w:tcPr>
-            <w:tcW w:w="4490" w:type="dxa"/>
+            <w:tcW w:w="5150" w:type="dxa"/>
             <w:tcBorders>
               <w:top w:val="dotted" w:sz="4" w:space="0" w:color="000000"/>
               <w:left w:val="dotted" w:sz="4" w:space="0" w:color="000000"/>
@@ -2476,7 +2485,7 @@
         </w:tc>
         <w:tc>
           <w:tcPr>
-            <w:tcW w:w="4490" w:type="dxa"/>
+            <w:tcW w:w="5150" w:type="dxa"/>
             <w:tcBorders>
               <w:top w:val="dotted" w:sz="4" w:space="0" w:color="000000"/>
               <w:left w:val="dotted" w:sz="4" w:space="0" w:color="000000"/>
@@ -2535,7 +2544,7 @@
         </w:tc>
         <w:tc>
           <w:tcPr>
-            <w:tcW w:w="4490" w:type="dxa"/>
+            <w:tcW w:w="5150" w:type="dxa"/>
             <w:tcBorders>
               <w:top w:val="dotted" w:sz="4" w:space="0" w:color="000000"/>
               <w:left w:val="dotted" w:sz="4" w:space="0" w:color="000000"/>
@@ -2594,7 +2603,7 @@
         </w:tc>
         <w:tc>
           <w:tcPr>
-            <w:tcW w:w="4490" w:type="dxa"/>
+            <w:tcW w:w="5150" w:type="dxa"/>
             <w:tcBorders>
               <w:top w:val="dotted" w:sz="4" w:space="0" w:color="000000"/>
               <w:left w:val="dotted" w:sz="4" w:space="0" w:color="000000"/>
@@ -2607,25 +2616,6 @@
         </w:tc>
       </w:tr>
     </w:tbl>
-    <w:p>
-      <w:pPr>
-        <w:rPr>
-          <w:rFonts w:ascii="Arial" w:eastAsia="Arial" w:hAnsi="Arial" w:cs="Arial"/>
-          <w:sz w:val="16"/>
-          <w:szCs w:val="16"/>
-        </w:rPr>
-        <w:sectPr>
-          <w:headerReference w:type="default" r:id="rId7"/>
-          <w:footerReference w:type="default" r:id="rId8"/>
-          <w:headerReference w:type="first" r:id="rId9"/>
-          <w:footerReference w:type="first" r:id="rId10"/>
-          <w:pgSz w:w="12240" w:h="15840"/>
-          <w:pgMar w:top="1275" w:right="1540" w:bottom="1200" w:left="1460" w:header="324" w:footer="1005" w:gutter="0"/>
-          <w:pgNumType w:start="1"/>
-          <w:cols w:space="720"/>
-        </w:sectPr>
-      </w:pPr>
-    </w:p>
     <w:p>
       <w:pPr>
         <w:pBdr>
@@ -2692,7 +2682,7 @@
     <w:tbl>
       <w:tblPr>
         <w:tblStyle w:val="a3"/>
-        <w:tblW w:w="9780" w:type="dxa"/>
+        <w:tblW w:w="9638" w:type="dxa"/>
         <w:tblInd w:w="138" w:type="dxa"/>
         <w:tblBorders>
           <w:top w:val="single" w:sz="4" w:space="0" w:color="000000"/>
@@ -2708,7 +2698,7 @@
       <w:tblGrid>
         <w:gridCol w:w="4485"/>
         <w:gridCol w:w="2220"/>
-        <w:gridCol w:w="3075"/>
+        <w:gridCol w:w="2933"/>
       </w:tblGrid>
       <w:tr>
         <w:trPr>
@@ -2775,7 +2765,7 @@
         </w:tc>
         <w:tc>
           <w:tcPr>
-            <w:tcW w:w="5295" w:type="dxa"/>
+            <w:tcW w:w="5153" w:type="dxa"/>
             <w:gridSpan w:val="2"/>
             <w:tcBorders>
               <w:top w:val="dotted" w:sz="4" w:space="0" w:color="000000"/>
@@ -2863,7 +2853,7 @@
         </w:tc>
         <w:tc>
           <w:tcPr>
-            <w:tcW w:w="5295" w:type="dxa"/>
+            <w:tcW w:w="5153" w:type="dxa"/>
             <w:gridSpan w:val="2"/>
             <w:tcBorders>
               <w:top w:val="dotted" w:sz="4" w:space="0" w:color="000000"/>
@@ -3033,7 +3023,7 @@
         </w:tc>
         <w:tc>
           <w:tcPr>
-            <w:tcW w:w="3075" w:type="dxa"/>
+            <w:tcW w:w="2933" w:type="dxa"/>
             <w:tcBorders>
               <w:top w:val="dotted" w:sz="4" w:space="0" w:color="000000"/>
               <w:left w:val="dotted" w:sz="4" w:space="0" w:color="000000"/>
@@ -3160,7 +3150,7 @@
         </w:tc>
         <w:tc>
           <w:tcPr>
-            <w:tcW w:w="3075" w:type="dxa"/>
+            <w:tcW w:w="2933" w:type="dxa"/>
             <w:tcBorders>
               <w:top w:val="dotted" w:sz="4" w:space="0" w:color="000000"/>
               <w:left w:val="dotted" w:sz="4" w:space="0" w:color="000000"/>
@@ -3246,7 +3236,7 @@
         </w:tc>
         <w:tc>
           <w:tcPr>
-            <w:tcW w:w="3075" w:type="dxa"/>
+            <w:tcW w:w="2933" w:type="dxa"/>
             <w:tcBorders>
               <w:top w:val="dotted" w:sz="4" w:space="0" w:color="000000"/>
               <w:left w:val="dotted" w:sz="4" w:space="0" w:color="000000"/>
@@ -3349,7 +3339,7 @@
         </w:tc>
         <w:tc>
           <w:tcPr>
-            <w:tcW w:w="3075" w:type="dxa"/>
+            <w:tcW w:w="2933" w:type="dxa"/>
             <w:tcBorders>
               <w:top w:val="dotted" w:sz="4" w:space="0" w:color="000000"/>
               <w:left w:val="dotted" w:sz="4" w:space="0" w:color="000000"/>
@@ -3452,7 +3442,7 @@
         </w:tc>
         <w:tc>
           <w:tcPr>
-            <w:tcW w:w="3075" w:type="dxa"/>
+            <w:tcW w:w="2933" w:type="dxa"/>
             <w:tcBorders>
               <w:top w:val="dotted" w:sz="4" w:space="0" w:color="000000"/>
               <w:left w:val="dotted" w:sz="4" w:space="0" w:color="000000"/>
@@ -3555,7 +3545,7 @@
         </w:tc>
         <w:tc>
           <w:tcPr>
-            <w:tcW w:w="3075" w:type="dxa"/>
+            <w:tcW w:w="2933" w:type="dxa"/>
             <w:tcBorders>
               <w:top w:val="dotted" w:sz="4" w:space="0" w:color="000000"/>
               <w:left w:val="dotted" w:sz="4" w:space="0" w:color="000000"/>
@@ -3655,7 +3645,7 @@
         </w:tc>
         <w:tc>
           <w:tcPr>
-            <w:tcW w:w="3075" w:type="dxa"/>
+            <w:tcW w:w="2933" w:type="dxa"/>
             <w:tcBorders>
               <w:top w:val="dotted" w:sz="4" w:space="0" w:color="000000"/>
               <w:left w:val="dotted" w:sz="4" w:space="0" w:color="000000"/>
@@ -3744,7 +3734,7 @@
         </w:tc>
         <w:tc>
           <w:tcPr>
-            <w:tcW w:w="3075" w:type="dxa"/>
+            <w:tcW w:w="2933" w:type="dxa"/>
             <w:tcBorders>
               <w:top w:val="dotted" w:sz="4" w:space="0" w:color="000000"/>
               <w:left w:val="dotted" w:sz="4" w:space="0" w:color="000000"/>
@@ -3796,6 +3786,7 @@
           <w:sz w:val="20"/>
           <w:szCs w:val="20"/>
         </w:rPr>
+        <w:lastRenderedPageBreak/>
         <w:t>Otros Datos</w:t>
       </w:r>
     </w:p>
@@ -3822,7 +3813,7 @@
     <w:tbl>
       <w:tblPr>
         <w:tblStyle w:val="a4"/>
-        <w:tblW w:w="9360" w:type="dxa"/>
+        <w:tblW w:w="9638" w:type="dxa"/>
         <w:tblInd w:w="138" w:type="dxa"/>
         <w:tblBorders>
           <w:top w:val="single" w:sz="4" w:space="0" w:color="000000"/>
@@ -3837,7 +3828,7 @@
       </w:tblPr>
       <w:tblGrid>
         <w:gridCol w:w="4485"/>
-        <w:gridCol w:w="4875"/>
+        <w:gridCol w:w="5153"/>
       </w:tblGrid>
       <w:tr>
         <w:tc>
@@ -3932,7 +3923,7 @@
         </w:tc>
         <w:tc>
           <w:tcPr>
-            <w:tcW w:w="4875" w:type="dxa"/>
+            <w:tcW w:w="5153" w:type="dxa"/>
             <w:tcBorders>
               <w:top w:val="dotted" w:sz="4" w:space="0" w:color="000000"/>
               <w:left w:val="dotted" w:sz="4" w:space="0" w:color="000000"/>
@@ -3967,7 +3958,7 @@
     <w:tbl>
       <w:tblPr>
         <w:tblStyle w:val="a5"/>
-        <w:tblW w:w="9330" w:type="dxa"/>
+        <w:tblW w:w="9638" w:type="dxa"/>
         <w:tblInd w:w="138" w:type="dxa"/>
         <w:tblBorders>
           <w:top w:val="single" w:sz="4" w:space="0" w:color="000000"/>
@@ -3982,7 +3973,7 @@
       </w:tblPr>
       <w:tblGrid>
         <w:gridCol w:w="4485"/>
-        <w:gridCol w:w="4845"/>
+        <w:gridCol w:w="5153"/>
       </w:tblGrid>
       <w:tr>
         <w:tc>
@@ -4031,7 +4022,7 @@
         </w:tc>
         <w:tc>
           <w:tcPr>
-            <w:tcW w:w="4845" w:type="dxa"/>
+            <w:tcW w:w="5153" w:type="dxa"/>
             <w:tcBorders>
               <w:top w:val="dotted" w:sz="4" w:space="0" w:color="000000"/>
               <w:left w:val="dotted" w:sz="4" w:space="0" w:color="000000"/>
@@ -4093,7 +4084,7 @@
         </w:tc>
         <w:tc>
           <w:tcPr>
-            <w:tcW w:w="4845" w:type="dxa"/>
+            <w:tcW w:w="5153" w:type="dxa"/>
             <w:tcBorders>
               <w:top w:val="dotted" w:sz="4" w:space="0" w:color="000000"/>
               <w:left w:val="dotted" w:sz="4" w:space="0" w:color="000000"/>
@@ -4132,44 +4123,6 @@
         </w:tc>
       </w:tr>
     </w:tbl>
-    <w:p>
-      <w:pPr>
-        <w:pBdr>
-          <w:top w:val="nil"/>
-          <w:left w:val="nil"/>
-          <w:bottom w:val="nil"/>
-          <w:right w:val="nil"/>
-          <w:between w:val="nil"/>
-        </w:pBdr>
-        <w:spacing w:before="11"/>
-        <w:rPr>
-          <w:rFonts w:ascii="Arial" w:eastAsia="Arial" w:hAnsi="Arial" w:cs="Arial"/>
-          <w:b/>
-          <w:bCs/>
-          <w:sz w:val="28"/>
-          <w:szCs w:val="28"/>
-        </w:rPr>
-      </w:pPr>
-    </w:p>
-    <w:p>
-      <w:pPr>
-        <w:pBdr>
-          <w:top w:val="nil"/>
-          <w:left w:val="nil"/>
-          <w:bottom w:val="nil"/>
-          <w:right w:val="nil"/>
-          <w:between w:val="nil"/>
-        </w:pBdr>
-        <w:spacing w:before="11"/>
-        <w:rPr>
-          <w:rFonts w:ascii="Arial" w:eastAsia="Arial" w:hAnsi="Arial" w:cs="Arial"/>
-          <w:b/>
-          <w:bCs/>
-          <w:sz w:val="28"/>
-          <w:szCs w:val="28"/>
-        </w:rPr>
-      </w:pPr>
-    </w:p>
     <w:p>
       <w:pPr>
         <w:pBdr>
@@ -4361,173 +4314,6 @@
     </w:p>
     <w:p>
       <w:pPr>
-        <w:rPr>
-          <w:rFonts w:ascii="Arial" w:eastAsia="Arial" w:hAnsi="Arial" w:cs="Arial"/>
-          <w:i/>
-          <w:iCs/>
-          <w:sz w:val="14"/>
-          <w:szCs w:val="14"/>
-        </w:rPr>
-      </w:pPr>
-    </w:p>
-    <w:p>
-      <w:pPr>
-        <w:spacing w:before="11" w:after="1"/>
-        <w:rPr>
-          <w:rFonts w:ascii="Arial" w:eastAsia="Arial" w:hAnsi="Arial" w:cs="Arial"/>
-          <w:i/>
-          <w:iCs/>
-          <w:sz w:val="12"/>
-          <w:szCs w:val="12"/>
-        </w:rPr>
-      </w:pPr>
-    </w:p>
-    <w:p>
-      <w:pPr>
-        <w:spacing w:before="11" w:after="1"/>
-        <w:rPr>
-          <w:rFonts w:ascii="Arial" w:eastAsia="Arial" w:hAnsi="Arial" w:cs="Arial"/>
-          <w:i/>
-          <w:iCs/>
-          <w:sz w:val="12"/>
-          <w:szCs w:val="12"/>
-        </w:rPr>
-      </w:pPr>
-    </w:p>
-    <w:p>
-      <w:pPr>
-        <w:spacing w:before="11" w:after="1"/>
-        <w:rPr>
-          <w:rFonts w:ascii="Arial" w:eastAsia="Arial" w:hAnsi="Arial" w:cs="Arial"/>
-          <w:i/>
-          <w:iCs/>
-          <w:sz w:val="12"/>
-          <w:szCs w:val="12"/>
-        </w:rPr>
-      </w:pPr>
-      <w:r>
-        <w:rPr>
-          <w:noProof/>
-        </w:rPr>
-        <w:drawing>
-          <wp:anchor distT="0" distB="0" distL="0" distR="0" simplePos="0" relativeHeight="251659264" behindDoc="1" locked="0" layoutInCell="1" hidden="0" allowOverlap="1" wp14:anchorId="5DA34F1F" wp14:editId="5D1F3BC4">
-            <wp:simplePos x="0" y="0"/>
-            <wp:positionH relativeFrom="column">
-              <wp:posOffset>3819525</wp:posOffset>
-            </wp:positionH>
-            <wp:positionV relativeFrom="paragraph">
-              <wp:posOffset>57150</wp:posOffset>
-            </wp:positionV>
-            <wp:extent cx="521569" cy="1022603"/>
-            <wp:effectExtent l="0" t="0" r="0" b="0"/>
-            <wp:wrapNone/>
-            <wp:docPr id="3" name="image2.png" descr="A close up of a signature&#10;&#10;AI-generated content may be incorrect."/>
-            <wp:cNvGraphicFramePr/>
-            <a:graphic xmlns:a="http://schemas.openxmlformats.org/drawingml/2006/main">
-              <a:graphicData uri="http://schemas.openxmlformats.org/drawingml/2006/picture">
-                <pic:pic xmlns:pic="http://schemas.openxmlformats.org/drawingml/2006/picture">
-                  <pic:nvPicPr>
-                    <pic:cNvPr id="0" name="image2.png" descr="A close up of a signature&#10;&#10;AI-generated content may be incorrect."/>
-                    <pic:cNvPicPr preferRelativeResize="0"/>
-                  </pic:nvPicPr>
-                  <pic:blipFill>
-                    <a:blip r:embed="rId11"/>
-                    <a:srcRect/>
-                    <a:stretch>
-                      <a:fillRect/>
-                    </a:stretch>
-                  </pic:blipFill>
-                  <pic:spPr>
-                    <a:xfrm>
-                      <a:off x="0" y="0"/>
-                      <a:ext cx="521569" cy="1022603"/>
-                    </a:xfrm>
-                    <a:prstGeom prst="rect">
-                      <a:avLst/>
-                    </a:prstGeom>
-                    <a:ln/>
-                  </pic:spPr>
-                </pic:pic>
-              </a:graphicData>
-            </a:graphic>
-          </wp:anchor>
-        </w:drawing>
-      </w:r>
-    </w:p>
-    <w:p>
-      <w:pPr>
-        <w:spacing w:before="11" w:after="1"/>
-        <w:rPr>
-          <w:rFonts w:ascii="Arial" w:eastAsia="Arial" w:hAnsi="Arial" w:cs="Arial"/>
-          <w:i/>
-          <w:iCs/>
-          <w:sz w:val="12"/>
-          <w:szCs w:val="12"/>
-        </w:rPr>
-      </w:pPr>
-    </w:p>
-    <w:p>
-      <w:pPr>
-        <w:spacing w:before="11" w:after="1"/>
-        <w:rPr>
-          <w:rFonts w:ascii="Arial" w:eastAsia="Arial" w:hAnsi="Arial" w:cs="Arial"/>
-          <w:i/>
-          <w:iCs/>
-          <w:sz w:val="12"/>
-          <w:szCs w:val="12"/>
-        </w:rPr>
-      </w:pPr>
-    </w:p>
-    <w:p>
-      <w:pPr>
-        <w:spacing w:before="11" w:after="1"/>
-        <w:rPr>
-          <w:rFonts w:ascii="Arial" w:eastAsia="Arial" w:hAnsi="Arial" w:cs="Arial"/>
-          <w:i/>
-          <w:iCs/>
-          <w:sz w:val="12"/>
-          <w:szCs w:val="12"/>
-        </w:rPr>
-      </w:pPr>
-    </w:p>
-    <w:p>
-      <w:pPr>
-        <w:spacing w:before="11" w:after="1"/>
-        <w:rPr>
-          <w:rFonts w:ascii="Arial" w:eastAsia="Arial" w:hAnsi="Arial" w:cs="Arial"/>
-          <w:i/>
-          <w:iCs/>
-          <w:sz w:val="12"/>
-          <w:szCs w:val="12"/>
-        </w:rPr>
-      </w:pPr>
-    </w:p>
-    <w:p>
-      <w:pPr>
-        <w:spacing w:before="11" w:after="1"/>
-        <w:rPr>
-          <w:rFonts w:ascii="Arial" w:eastAsia="Arial" w:hAnsi="Arial" w:cs="Arial"/>
-          <w:i/>
-          <w:iCs/>
-          <w:sz w:val="12"/>
-          <w:szCs w:val="12"/>
-        </w:rPr>
-      </w:pPr>
-    </w:p>
-    <w:p>
-      <w:pPr>
-        <w:spacing w:before="11" w:after="1"/>
-        <w:rPr>
-          <w:rFonts w:ascii="Arial" w:eastAsia="Arial" w:hAnsi="Arial" w:cs="Arial"/>
-          <w:i/>
-          <w:iCs/>
-          <w:sz w:val="12"/>
-          <w:szCs w:val="12"/>
-        </w:rPr>
-      </w:pPr>
-    </w:p>
-    <w:p>
-      <w:pPr>
         <w:spacing w:before="11" w:after="1"/>
         <w:rPr>
           <w:rFonts w:ascii="Arial" w:eastAsia="Arial" w:hAnsi="Arial" w:cs="Arial"/>
@@ -4646,6 +4432,7 @@
                 <w:right w:val="nil"/>
                 <w:between w:val="nil"/>
               </w:pBdr>
+              <w:jc w:val="center"/>
               <w:rPr>
                 <w:rFonts w:ascii="Arial" w:eastAsia="Arial" w:hAnsi="Arial" w:cs="Arial"/>
                 <w:color w:val="000000"/>
@@ -4653,6 +4440,60 @@
                 <w:szCs w:val="14"/>
               </w:rPr>
             </w:pPr>
+            <w:r>
+              <w:rPr>
+                <w:rFonts w:ascii="Arial" w:eastAsia="Arial" w:hAnsi="Arial" w:cs="Arial"/>
+                <w:noProof/>
+                <w:color w:val="000000"/>
+                <w:sz w:val="14"/>
+                <w:szCs w:val="14"/>
+              </w:rPr>
+              <w:drawing>
+                <wp:inline distT="0" distB="0" distL="0" distR="0" wp14:anchorId="3814E33E" wp14:editId="0BA886CD">
+                  <wp:extent cx="518160" cy="1024255"/>
+                  <wp:effectExtent l="0" t="0" r="0" b="4445"/>
+                  <wp:docPr id="1428014989" name="Imagen 16"/>
+                  <wp:cNvGraphicFramePr>
+                    <a:graphicFrameLocks xmlns:a="http://schemas.openxmlformats.org/drawingml/2006/main" noChangeAspect="1"/>
+                  </wp:cNvGraphicFramePr>
+                  <a:graphic xmlns:a="http://schemas.openxmlformats.org/drawingml/2006/main">
+                    <a:graphicData uri="http://schemas.openxmlformats.org/drawingml/2006/picture">
+                      <pic:pic xmlns:pic="http://schemas.openxmlformats.org/drawingml/2006/picture">
+                        <pic:nvPicPr>
+                          <pic:cNvPr id="0" name="Picture 2"/>
+                          <pic:cNvPicPr>
+                            <a:picLocks noChangeAspect="1" noChangeArrowheads="1"/>
+                          </pic:cNvPicPr>
+                        </pic:nvPicPr>
+                        <pic:blipFill>
+                          <a:blip r:embed="rId7">
+                            <a:extLst>
+                              <a:ext uri="{28A0092B-C50C-407E-A947-70E740481C1C}">
+                                <a14:useLocalDpi xmlns:a14="http://schemas.microsoft.com/office/drawing/2010/main" val="0"/>
+                              </a:ext>
+                            </a:extLst>
+                          </a:blip>
+                          <a:srcRect/>
+                          <a:stretch>
+                            <a:fillRect/>
+                          </a:stretch>
+                        </pic:blipFill>
+                        <pic:spPr bwMode="auto">
+                          <a:xfrm>
+                            <a:off x="0" y="0"/>
+                            <a:ext cx="518160" cy="1024255"/>
+                          </a:xfrm>
+                          <a:prstGeom prst="rect">
+                            <a:avLst/>
+                          </a:prstGeom>
+                          <a:noFill/>
+                        </pic:spPr>
+                      </pic:pic>
+                    </a:graphicData>
+                  </a:graphic>
+                </wp:inline>
+              </w:drawing>
+            </w:r>
           </w:p>
         </w:tc>
       </w:tr>
@@ -4778,6 +4619,8 @@
       </w:pPr>
     </w:p>
     <w:sectPr>
+      <w:headerReference w:type="default" r:id="rId8"/>
+      <w:footerReference w:type="default" r:id="rId9"/>
       <w:pgSz w:w="12240" w:h="15840"/>
       <w:pgMar w:top="1000" w:right="1540" w:bottom="1200" w:left="1460" w:header="324" w:footer="1005" w:gutter="0"/>
       <w:cols w:space="720"/>
@@ -4951,12 +4794,6 @@
 </w:ftr>
 </file>
 
-<file path=word/footer2.xml><?xml version="1.0" encoding="utf-8"?>
-<w:ftr xmlns:wpc="http://schemas.microsoft.com/office/word/2010/wordprocessingCanvas" xmlns:cx="http://schemas.microsoft.com/office/drawing/2014/chartex" xmlns:cx1="http://schemas.microsoft.com/office/drawing/2015/9/8/chartex" xmlns:cx2="http://schemas.microsoft.com/office/drawing/2015/10/21/chartex" xmlns:cx3="http://schemas.microsoft.com/office/drawing/2016/5/9/chartex" xmlns:cx4="http://schemas.microsoft.com/office/drawing/2016/5/10/chartex" xmlns:cx5="http://schemas.microsoft.com/office/drawing/2016/5/11/chartex" xmlns:cx6="http://schemas.microsoft.com/office/drawing/2016/5/12/chartex" xmlns:cx7="http://schemas.microsoft.com/office/drawing/2016/5/13/chartex" xmlns:cx8="http://schemas.microsoft.com/office/drawing/2016/5/14/chartex" xmlns:mc="http://schemas.openxmlformats.org/markup-compatibility/2006" xmlns:aink="http://schemas.microsoft.com/office/drawing/2016/ink" xmlns:am3d="http://schemas.microsoft.com/office/drawing/2017/model3d" xmlns:o="urn:schemas-microsoft-com:office:office" xmlns:oel="http://schemas.microsoft.com/office/2019/extlst" xmlns:r="http://schemas.openxmlformats.org/officeDocument/2006/relationships" xmlns:m="http://schemas.openxmlformats.org/officeDocument/2006/math" xmlns:v="urn:schemas-microsoft-com:vml" xmlns:wp14="http://schemas.microsoft.com/office/word/2010/wordprocessingDrawing" xmlns:wp="http://schemas.openxmlformats.org/drawingml/2006/wordprocessingDrawing" xmlns:w10="urn:schemas-microsoft-com:office:word" xmlns:w="http://schemas.openxmlformats.org/wordprocessingml/2006/main" xmlns:w14="http://schemas.microsoft.com/office/word/2010/wordml" xmlns:w15="http://schemas.microsoft.com/office/word/2012/wordml" xmlns:w16cex="http://schemas.microsoft.com/office/word/2018/wordml/cex" xmlns:w16cid="http://schemas.microsoft.com/office/word/2016/wordml/cid" xmlns:w16="http://schemas.microsoft.com/office/word/2018/wordml" xmlns:w16du="http://schemas.microsoft.com/office/word/2023/wordml/word16du" xmlns:w16sdtdh="http://schemas.microsoft.com/office/word/2020/wordml/sdtdatahash" xmlns:w16sdtfl="http://schemas.microsoft.com/office/word/2024/wordml/sdtformatlock" xmlns:w16se="http://schemas.microsoft.com/office/word/2015/wordml/symex" xmlns:wpg="http://schemas.microsoft.com/office/word/2010/wordprocessingGroup" xmlns:wpi="http://schemas.microsoft.com/office/word/2010/wordprocessingInk" xmlns:wne="http://schemas.microsoft.com/office/word/2006/wordml" xmlns:wps="http://schemas.microsoft.com/office/word/2010/wordprocessingShape" mc:Ignorable="w14 w15 w16se w16cid w16 w16cex w16sdtdh w16sdtfl w16du wp14">
-  <w:p/>
-</w:ftr>
-</file>
-
 <file path=word/footnotes.xml><?xml version="1.0" encoding="utf-8"?>
 <w:footnotes xmlns:wpc="http://schemas.microsoft.com/office/word/2010/wordprocessingCanvas" xmlns:cx="http://schemas.microsoft.com/office/drawing/2014/chartex" xmlns:cx1="http://schemas.microsoft.com/office/drawing/2015/9/8/chartex" xmlns:cx2="http://schemas.microsoft.com/office/drawing/2015/10/21/chartex" xmlns:cx3="http://schemas.microsoft.com/office/drawing/2016/5/9/chartex" xmlns:cx4="http://schemas.microsoft.com/office/drawing/2016/5/10/chartex" xmlns:cx5="http://schemas.microsoft.com/office/drawing/2016/5/11/chartex" xmlns:cx6="http://schemas.microsoft.com/office/drawing/2016/5/12/chartex" xmlns:cx7="http://schemas.microsoft.com/office/drawing/2016/5/13/chartex" xmlns:cx8="http://schemas.microsoft.com/office/drawing/2016/5/14/chartex" xmlns:mc="http://schemas.openxmlformats.org/markup-compatibility/2006" xmlns:aink="http://schemas.microsoft.com/office/drawing/2016/ink" xmlns:am3d="http://schemas.microsoft.com/office/drawing/2017/model3d" xmlns:o="urn:schemas-microsoft-com:office:office" xmlns:oel="http://schemas.microsoft.com/office/2019/extlst" xmlns:r="http://schemas.openxmlformats.org/officeDocument/2006/relationships" xmlns:m="http://schemas.openxmlformats.org/officeDocument/2006/math" xmlns:v="urn:schemas-microsoft-com:vml" xmlns:wp14="http://schemas.microsoft.com/office/word/2010/wordprocessingDrawing" xmlns:wp="http://schemas.openxmlformats.org/drawingml/2006/wordprocessingDrawing" xmlns:w10="urn:schemas-microsoft-com:office:word" xmlns:w="http://schemas.openxmlformats.org/wordprocessingml/2006/main" xmlns:w14="http://schemas.microsoft.com/office/word/2010/wordml" xmlns:w15="http://schemas.microsoft.com/office/word/2012/wordml" xmlns:w16cex="http://schemas.microsoft.com/office/word/2018/wordml/cex" xmlns:w16cid="http://schemas.microsoft.com/office/word/2016/wordml/cid" xmlns:w16="http://schemas.microsoft.com/office/word/2018/wordml" xmlns:w16du="http://schemas.microsoft.com/office/word/2023/wordml/word16du" xmlns:w16sdtdh="http://schemas.microsoft.com/office/word/2020/wordml/sdtdatahash" xmlns:w16sdtfl="http://schemas.microsoft.com/office/word/2024/wordml/sdtformatlock" xmlns:w16se="http://schemas.microsoft.com/office/word/2015/wordml/symex" xmlns:wpg="http://schemas.microsoft.com/office/word/2010/wordprocessingGroup" xmlns:wpi="http://schemas.microsoft.com/office/word/2010/wordprocessingInk" xmlns:wne="http://schemas.microsoft.com/office/word/2006/wordml" xmlns:wps="http://schemas.microsoft.com/office/word/2010/wordprocessingShape" mc:Ignorable="w14 w15 w16se w16cid w16 w16cex w16sdtdh w16sdtfl w16du wp14">
   <w:footnote w:type="separator" w:id="-1">
@@ -5047,21 +4884,21 @@
     <w:pPr>
       <w:ind w:right="18"/>
       <w:jc w:val="right"/>
+    </w:pPr>
+    <w:r>
+      <w:t>Res. S.I.C. N°237/24 y sus complementarias</w:t>
+    </w:r>
+  </w:p>
+  <w:p>
+    <w:pPr>
+      <w:ind w:right="18"/>
+      <w:jc w:val="right"/>
       <w:rPr>
         <w:sz w:val="20"/>
         <w:szCs w:val="20"/>
       </w:rPr>
     </w:pPr>
-    <w:r>
-      <w:t>Res. S.I.C. N°237/24 y sus complementarias</w:t>
-    </w:r>
   </w:p>
-</w:hdr>
-</file>
-
-<file path=word/header2.xml><?xml version="1.0" encoding="utf-8"?>
-<w:hdr xmlns:wpc="http://schemas.microsoft.com/office/word/2010/wordprocessingCanvas" xmlns:cx="http://schemas.microsoft.com/office/drawing/2014/chartex" xmlns:cx1="http://schemas.microsoft.com/office/drawing/2015/9/8/chartex" xmlns:cx2="http://schemas.microsoft.com/office/drawing/2015/10/21/chartex" xmlns:cx3="http://schemas.microsoft.com/office/drawing/2016/5/9/chartex" xmlns:cx4="http://schemas.microsoft.com/office/drawing/2016/5/10/chartex" xmlns:cx5="http://schemas.microsoft.com/office/drawing/2016/5/11/chartex" xmlns:cx6="http://schemas.microsoft.com/office/drawing/2016/5/12/chartex" xmlns:cx7="http://schemas.microsoft.com/office/drawing/2016/5/13/chartex" xmlns:cx8="http://schemas.microsoft.com/office/drawing/2016/5/14/chartex" xmlns:mc="http://schemas.openxmlformats.org/markup-compatibility/2006" xmlns:aink="http://schemas.microsoft.com/office/drawing/2016/ink" xmlns:am3d="http://schemas.microsoft.com/office/drawing/2017/model3d" xmlns:o="urn:schemas-microsoft-com:office:office" xmlns:oel="http://schemas.microsoft.com/office/2019/extlst" xmlns:r="http://schemas.openxmlformats.org/officeDocument/2006/relationships" xmlns:m="http://schemas.openxmlformats.org/officeDocument/2006/math" xmlns:v="urn:schemas-microsoft-com:vml" xmlns:wp14="http://schemas.microsoft.com/office/word/2010/wordprocessingDrawing" xmlns:wp="http://schemas.openxmlformats.org/drawingml/2006/wordprocessingDrawing" xmlns:w10="urn:schemas-microsoft-com:office:word" xmlns:w="http://schemas.openxmlformats.org/wordprocessingml/2006/main" xmlns:w14="http://schemas.microsoft.com/office/word/2010/wordml" xmlns:w15="http://schemas.microsoft.com/office/word/2012/wordml" xmlns:w16cex="http://schemas.microsoft.com/office/word/2018/wordml/cex" xmlns:w16cid="http://schemas.microsoft.com/office/word/2016/wordml/cid" xmlns:w16="http://schemas.microsoft.com/office/word/2018/wordml" xmlns:w16du="http://schemas.microsoft.com/office/word/2023/wordml/word16du" xmlns:w16sdtdh="http://schemas.microsoft.com/office/word/2020/wordml/sdtdatahash" xmlns:w16sdtfl="http://schemas.microsoft.com/office/word/2024/wordml/sdtformatlock" xmlns:w16se="http://schemas.microsoft.com/office/word/2015/wordml/symex" xmlns:wpg="http://schemas.microsoft.com/office/word/2010/wordprocessingGroup" xmlns:wpi="http://schemas.microsoft.com/office/word/2010/wordprocessingInk" xmlns:wne="http://schemas.microsoft.com/office/word/2006/wordml" xmlns:wps="http://schemas.microsoft.com/office/word/2010/wordprocessingShape" mc:Ignorable="w14 w15 w16se w16cid w16 w16cex w16sdtdh w16sdtfl w16du wp14">
-  <w:p/>
 </w:hdr>
 </file>
 
@@ -5759,6 +5596,48 @@
       </w:tblCellMar>
     </w:tblPr>
   </w:style>
+  <w:style w:type="paragraph" w:styleId="Encabezado">
+    <w:name w:val="header"/>
+    <w:basedOn w:val="Normal"/>
+    <w:link w:val="EncabezadoCar"/>
+    <w:uiPriority w:val="99"/>
+    <w:unhideWhenUsed/>
+    <w:rsid w:val="00753BA1"/>
+    <w:pPr>
+      <w:tabs>
+        <w:tab w:val="center" w:pos="4252"/>
+        <w:tab w:val="right" w:pos="8504"/>
+      </w:tabs>
+    </w:pPr>
+  </w:style>
+  <w:style w:type="character" w:customStyle="1" w:styleId="EncabezadoCar">
+    <w:name w:val="Encabezado Car"/>
+    <w:basedOn w:val="Fuentedeprrafopredeter"/>
+    <w:link w:val="Encabezado"/>
+    <w:uiPriority w:val="99"/>
+    <w:rsid w:val="00753BA1"/>
+  </w:style>
+  <w:style w:type="paragraph" w:styleId="Piedepgina">
+    <w:name w:val="footer"/>
+    <w:basedOn w:val="Normal"/>
+    <w:link w:val="PiedepginaCar"/>
+    <w:uiPriority w:val="99"/>
+    <w:unhideWhenUsed/>
+    <w:rsid w:val="00753BA1"/>
+    <w:pPr>
+      <w:tabs>
+        <w:tab w:val="center" w:pos="4252"/>
+        <w:tab w:val="right" w:pos="8504"/>
+      </w:tabs>
+    </w:pPr>
+  </w:style>
+  <w:style w:type="character" w:customStyle="1" w:styleId="PiedepginaCar">
+    <w:name w:val="Pie de página Car"/>
+    <w:basedOn w:val="Fuentedeprrafopredeter"/>
+    <w:link w:val="Piedepgina"/>
+    <w:uiPriority w:val="99"/>
+    <w:rsid w:val="00753BA1"/>
+  </w:style>
 </w:styles>
 </file>
 

</xml_diff>